<commit_message>
ml_price: related work (FINAL_REPORT §17, 10 papers) + docx rebuilt
Co-Authored-By: Claude Opus 5.5 <noreply@anthropic.com>
</commit_message>
<xml_diff>
--- a/ml_price/reports/final/FINAL_REPORT.docx
+++ b/ml_price/reports/final/FINAL_REPORT.docx
@@ -28,7 +28,7 @@
         </w:p>
       </w:sdtContent>
     </w:sdt>
-    <w:bookmarkStart w:id="54" w:name="X351ab4862a9720abd15d63d10815eb60941175e"/>
+    <w:bookmarkStart w:id="69" w:name="X351ab4862a9720abd15d63d10815eb60941175e"/>
     <w:p>
       <w:pPr>
         <w:pStyle w:val="Heading1"/>
@@ -761,15 +761,34 @@
         <w:t xml:space="preserve">by family fixed the test split.</w:t>
       </w:r>
     </w:p>
-    <w:p>
-      <w:r>
-        <w:pict>
-          <v:rect style="width:0;height:1.5pt" o:hralign="center" o:hrstd="t" o:hr="t"/>
-        </w:pict>
-      </w:r>
-    </w:p>
     <w:bookmarkEnd w:id="9"/>
-    <w:bookmarkStart w:id="13" w:name="Xdbf078d5fcf26c9825bf074c7748b11dc015b13"/>
+    <w:bookmarkStart w:id="10" w:name="X8797e4206763770a2512840fd1a7632977e4b76"/>
+    <w:p>
+      <w:pPr>
+        <w:pStyle w:val="Heading2"/>
+      </w:pPr>
+      <w:r>
+        <w:rPr>
+          <w:b/>
+          <w:bCs/>
+        </w:rPr>
+        <w:t xml:space="preserve">Research backing.</w:t>
+      </w:r>
+      <w:r>
+        <w:t xml:space="preserve"> </w:t>
+      </w:r>
+      <w:r>
+        <w:t xml:space="preserve">The approach is compared with 10 published papers in §17 (six read in full),</w:t>
+      </w:r>
+      <w:r>
+        <w:t xml:space="preserve"> </w:t>
+      </w:r>
+      <w:r>
+        <w:t xml:space="preserve">from LLM pricing at Alibaba and Amazon to a field study of Karnataka artisans.</w:t>
+      </w:r>
+    </w:p>
+    <w:bookmarkEnd w:id="10"/>
+    <w:bookmarkStart w:id="14" w:name="Xdbf078d5fcf26c9825bf074c7748b11dc015b13"/>
     <w:p>
       <w:pPr>
         <w:pStyle w:val="Heading2"/>
@@ -827,7 +846,7 @@
             <w:pPr>
               <w:pStyle w:val="Compact"/>
             </w:pPr>
-            <w:hyperlink r:id="rId10">
+            <w:hyperlink r:id="rId11">
               <w:r>
                 <w:rPr>
                   <w:rStyle w:val="Hyperlink"/>
@@ -1114,7 +1133,7 @@
       <w:r>
         <w:t xml:space="preserve"> </w:t>
       </w:r>
-      <w:hyperlink r:id="rId11">
+      <w:hyperlink r:id="rId12">
         <w:r>
           <w:rPr>
             <w:rStyle w:val="Hyperlink"/>
@@ -1128,7 +1147,7 @@
       <w:r>
         <w:t xml:space="preserve"> </w:t>
       </w:r>
-      <w:hyperlink r:id="rId12">
+      <w:hyperlink r:id="rId13">
         <w:r>
           <w:rPr>
             <w:rStyle w:val="Hyperlink"/>
@@ -1140,8 +1159,8 @@
         <w:t xml:space="preserve">.</w:t>
       </w:r>
     </w:p>
-    <w:bookmarkEnd w:id="13"/>
-    <w:bookmarkStart w:id="17" w:name="X8a00f17198233a31dbe924e051f1fff4b23cda3"/>
+    <w:bookmarkEnd w:id="14"/>
+    <w:bookmarkStart w:id="18" w:name="X8a00f17198233a31dbe924e051f1fff4b23cda3"/>
     <w:p>
       <w:pPr>
         <w:pStyle w:val="Heading2"/>
@@ -1420,7 +1439,7 @@
       <w:r>
         <w:t xml:space="preserve"> </w:t>
       </w:r>
-      <w:hyperlink r:id="rId14">
+      <w:hyperlink r:id="rId15">
         <w:r>
           <w:rPr>
             <w:rStyle w:val="Hyperlink"/>
@@ -1443,7 +1462,7 @@
       <w:r>
         <w:t xml:space="preserve"> </w:t>
       </w:r>
-      <w:hyperlink r:id="rId15">
+      <w:hyperlink r:id="rId16">
         <w:r>
           <w:rPr>
             <w:rStyle w:val="Hyperlink"/>
@@ -1466,7 +1485,7 @@
       <w:r>
         <w:t xml:space="preserve"> </w:t>
       </w:r>
-      <w:hyperlink r:id="rId16">
+      <w:hyperlink r:id="rId17">
         <w:r>
           <w:rPr>
             <w:rStyle w:val="Hyperlink"/>
@@ -1487,8 +1506,8 @@
         <w:t xml:space="preserve">One git commit per stage</w:t>
       </w:r>
     </w:p>
-    <w:bookmarkEnd w:id="17"/>
-    <w:bookmarkStart w:id="20" w:name="X7bc36c3a44e58314e70e90a5f0193ec90f556de"/>
+    <w:bookmarkEnd w:id="18"/>
+    <w:bookmarkStart w:id="21" w:name="X7bc36c3a44e58314e70e90a5f0193ec90f556de"/>
     <w:p>
       <w:pPr>
         <w:pStyle w:val="Heading2"/>
@@ -1957,7 +1976,7 @@
       <w:r>
         <w:t xml:space="preserve">(</w:t>
       </w:r>
-      <w:hyperlink r:id="rId18">
+      <w:hyperlink r:id="rId19">
         <w:r>
           <w:rPr>
             <w:rStyle w:val="Hyperlink"/>
@@ -1997,7 +2016,7 @@
       <w:r>
         <w:t xml:space="preserve"> </w:t>
       </w:r>
-      <w:hyperlink r:id="rId19">
+      <w:hyperlink r:id="rId20">
         <w:r>
           <w:rPr>
             <w:rStyle w:val="Hyperlink"/>
@@ -2009,8 +2028,8 @@
         <w:t xml:space="preserve">.</w:t>
       </w:r>
     </w:p>
-    <w:bookmarkEnd w:id="20"/>
-    <w:bookmarkStart w:id="21" w:name="Xdca3d12c00b5e6e9bc0fe85227d4b4aae73f7f5"/>
+    <w:bookmarkEnd w:id="21"/>
+    <w:bookmarkStart w:id="22" w:name="Xdca3d12c00b5e6e9bc0fe85227d4b4aae73f7f5"/>
     <w:p>
       <w:pPr>
         <w:pStyle w:val="Heading2"/>
@@ -2271,7 +2290,7 @@
       <w:r>
         <w:t xml:space="preserve"> </w:t>
       </w:r>
-      <w:hyperlink r:id="rId16">
+      <w:hyperlink r:id="rId17">
         <w:r>
           <w:rPr>
             <w:rStyle w:val="Hyperlink"/>
@@ -2283,8 +2302,8 @@
         <w:t xml:space="preserve">.</w:t>
       </w:r>
     </w:p>
-    <w:bookmarkEnd w:id="21"/>
-    <w:bookmarkStart w:id="23" w:name="Xa0087470b8d445ca124fca4742087cae3bd706c"/>
+    <w:bookmarkEnd w:id="22"/>
+    <w:bookmarkStart w:id="24" w:name="Xa0087470b8d445ca124fca4742087cae3bd706c"/>
     <w:p>
       <w:pPr>
         <w:pStyle w:val="Heading2"/>
@@ -2549,7 +2568,7 @@
       <w:r>
         <w:t xml:space="preserve"> </w:t>
       </w:r>
-      <w:hyperlink r:id="rId22">
+      <w:hyperlink r:id="rId23">
         <w:r>
           <w:rPr>
             <w:rStyle w:val="Hyperlink"/>
@@ -2561,8 +2580,8 @@
         <w:t xml:space="preserve">.</w:t>
       </w:r>
     </w:p>
-    <w:bookmarkEnd w:id="23"/>
-    <w:bookmarkStart w:id="25" w:name="X279f97a7fc263978827e005115d5dce52eb38bf"/>
+    <w:bookmarkEnd w:id="24"/>
+    <w:bookmarkStart w:id="26" w:name="X279f97a7fc263978827e005115d5dce52eb38bf"/>
     <w:p>
       <w:pPr>
         <w:pStyle w:val="Heading2"/>
@@ -2816,7 +2835,7 @@
       <w:r>
         <w:t xml:space="preserve"> </w:t>
       </w:r>
-      <w:hyperlink r:id="rId24">
+      <w:hyperlink r:id="rId25">
         <w:r>
           <w:rPr>
             <w:rStyle w:val="Hyperlink"/>
@@ -2828,8 +2847,8 @@
         <w:t xml:space="preserve">.</w:t>
       </w:r>
     </w:p>
-    <w:bookmarkEnd w:id="25"/>
-    <w:bookmarkStart w:id="27" w:name="Xacd927080cccea9a8326462bae9e81c378fb219"/>
+    <w:bookmarkEnd w:id="26"/>
+    <w:bookmarkStart w:id="28" w:name="Xacd927080cccea9a8326462bae9e81c378fb219"/>
     <w:p>
       <w:pPr>
         <w:pStyle w:val="Heading2"/>
@@ -3029,7 +3048,7 @@
       <w:r>
         <w:t xml:space="preserve"> </w:t>
       </w:r>
-      <w:hyperlink r:id="rId26">
+      <w:hyperlink r:id="rId27">
         <w:r>
           <w:rPr>
             <w:rStyle w:val="Hyperlink"/>
@@ -3041,8 +3060,8 @@
         <w:t xml:space="preserve">.</w:t>
       </w:r>
     </w:p>
-    <w:bookmarkEnd w:id="27"/>
-    <w:bookmarkStart w:id="33" w:name="X1b71b0704d0468f33a505daa7579258d506f53a"/>
+    <w:bookmarkEnd w:id="28"/>
+    <w:bookmarkStart w:id="34" w:name="X1b71b0704d0468f33a505daa7579258d506f53a"/>
     <w:p>
       <w:pPr>
         <w:pStyle w:val="Heading2"/>
@@ -3067,7 +3086,7 @@
       <w:r>
         <w:t xml:space="preserve"> </w:t>
       </w:r>
-      <w:hyperlink r:id="rId16">
+      <w:hyperlink r:id="rId17">
         <w:r>
           <w:rPr>
             <w:rStyle w:val="Hyperlink"/>
@@ -3711,18 +3730,18 @@
           <wp:inline>
             <wp:extent cx="5334000" cy="1500187"/>
             <wp:effectExtent b="0" l="0" r="0" t="0"/>
-            <wp:docPr descr="progress" title="" id="29" name="Picture"/>
+            <wp:docPr descr="progress" title="" id="30" name="Picture"/>
             <a:graphic>
               <a:graphicData uri="http://schemas.openxmlformats.org/drawingml/2006/picture">
                 <pic:pic>
                   <pic:nvPicPr>
-                    <pic:cNvPr descr="../../figures/experiments_progress.png" id="30" name="Picture"/>
+                    <pic:cNvPr descr="../../figures/experiments_progress.png" id="31" name="Picture"/>
                     <pic:cNvPicPr>
                       <a:picLocks noChangeArrowheads="1" noChangeAspect="1"/>
                     </pic:cNvPicPr>
                   </pic:nvPicPr>
                   <pic:blipFill>
-                    <a:blip r:embed="rId28"/>
+                    <a:blip r:embed="rId29"/>
                     <a:stretch>
                       <a:fillRect/>
                     </a:stretch>
@@ -4101,7 +4120,7 @@
       <w:r>
         <w:t xml:space="preserve"> </w:t>
       </w:r>
-      <w:hyperlink r:id="rId31">
+      <w:hyperlink r:id="rId32">
         <w:r>
           <w:rPr>
             <w:rStyle w:val="Hyperlink"/>
@@ -4115,7 +4134,7 @@
       <w:r>
         <w:t xml:space="preserve"> </w:t>
       </w:r>
-      <w:hyperlink r:id="rId32">
+      <w:hyperlink r:id="rId33">
         <w:r>
           <w:rPr>
             <w:rStyle w:val="Hyperlink"/>
@@ -4127,8 +4146,8 @@
         <w:t xml:space="preserve">.</w:t>
       </w:r>
     </w:p>
-    <w:bookmarkEnd w:id="33"/>
-    <w:bookmarkStart w:id="39" w:name="X64743a2956d92c42a420d3ed7198d80c0b5e9e4"/>
+    <w:bookmarkEnd w:id="34"/>
+    <w:bookmarkStart w:id="40" w:name="X64743a2956d92c42a420d3ed7198d80c0b5e9e4"/>
     <w:p>
       <w:pPr>
         <w:pStyle w:val="Heading2"/>
@@ -4537,7 +4556,7 @@
           <w:numId w:val="1010"/>
         </w:numPr>
       </w:pPr>
-      <w:hyperlink r:id="rId34">
+      <w:hyperlink r:id="rId35">
         <w:r>
           <w:rPr>
             <w:rStyle w:val="Hyperlink"/>
@@ -4691,7 +4710,7 @@
           <w:numId w:val="1011"/>
         </w:numPr>
       </w:pPr>
-      <w:hyperlink r:id="rId35">
+      <w:hyperlink r:id="rId36">
         <w:r>
           <w:rPr>
             <w:rStyle w:val="Hyperlink"/>
@@ -4756,7 +4775,7 @@
           <w:numId w:val="1012"/>
         </w:numPr>
       </w:pPr>
-      <w:hyperlink r:id="rId36">
+      <w:hyperlink r:id="rId37">
         <w:r>
           <w:rPr>
             <w:rStyle w:val="Hyperlink"/>
@@ -4843,7 +4862,7 @@
           <w:numId w:val="1013"/>
         </w:numPr>
       </w:pPr>
-      <w:hyperlink r:id="rId37">
+      <w:hyperlink r:id="rId38">
         <w:r>
           <w:rPr>
             <w:rStyle w:val="Hyperlink"/>
@@ -5152,7 +5171,7 @@
           <w:numId w:val="1014"/>
         </w:numPr>
       </w:pPr>
-      <w:hyperlink r:id="rId38">
+      <w:hyperlink r:id="rId39">
         <w:r>
           <w:rPr>
             <w:rStyle w:val="Hyperlink"/>
@@ -5161,8 +5180,8 @@
         </w:r>
       </w:hyperlink>
     </w:p>
-    <w:bookmarkEnd w:id="39"/>
-    <w:bookmarkStart w:id="40" w:name="X8d1a8e4ccfed42638ea722f033d54b841ab9ecc"/>
+    <w:bookmarkEnd w:id="40"/>
+    <w:bookmarkStart w:id="41" w:name="X8d1a8e4ccfed42638ea722f033d54b841ab9ecc"/>
     <w:p>
       <w:pPr>
         <w:pStyle w:val="Heading2"/>
@@ -5541,8 +5560,8 @@
         <w:t xml:space="preserve">labels on 6,434 rows.</w:t>
       </w:r>
     </w:p>
-    <w:bookmarkEnd w:id="40"/>
-    <w:bookmarkStart w:id="44" w:name="Xe8805d664e15c7abc95ce20c775d7095c291669"/>
+    <w:bookmarkEnd w:id="41"/>
+    <w:bookmarkStart w:id="45" w:name="Xe8805d664e15c7abc95ce20c775d7095c291669"/>
     <w:p>
       <w:pPr>
         <w:pStyle w:val="Heading2"/>
@@ -5935,18 +5954,18 @@
           <wp:inline>
             <wp:extent cx="5334000" cy="6371166"/>
             <wp:effectExtent b="0" l="0" r="0" t="0"/>
-            <wp:docPr descr="advisor" title="" id="42" name="Picture"/>
+            <wp:docPr descr="advisor" title="" id="43" name="Picture"/>
             <a:graphic>
               <a:graphicData uri="http://schemas.openxmlformats.org/drawingml/2006/picture">
                 <pic:pic>
                   <pic:nvPicPr>
-                    <pic:cNvPr descr="../../figures/P16_advisor_demo.jpg" id="43" name="Picture"/>
+                    <pic:cNvPr descr="../../figures/P16_advisor_demo.jpg" id="44" name="Picture"/>
                     <pic:cNvPicPr>
                       <a:picLocks noChangeArrowheads="1" noChangeAspect="1"/>
                     </pic:cNvPicPr>
                   </pic:nvPicPr>
                   <pic:blipFill>
-                    <a:blip r:embed="rId41"/>
+                    <a:blip r:embed="rId42"/>
                     <a:stretch>
                       <a:fillRect/>
                     </a:stretch>
@@ -5973,8 +5992,8 @@
         </w:drawing>
       </w:r>
     </w:p>
-    <w:bookmarkEnd w:id="44"/>
-    <w:bookmarkStart w:id="45" w:name="Xbb4079cc6a5cc823c9ec17782fbc85bf9598021"/>
+    <w:bookmarkEnd w:id="45"/>
+    <w:bookmarkStart w:id="46" w:name="Xbb4079cc6a5cc823c9ec17782fbc85bf9598021"/>
     <w:p>
       <w:pPr>
         <w:pStyle w:val="Heading2"/>
@@ -7761,8 +7780,8 @@
         <w:t xml:space="preserve">(e.g. technique → material → price band) with probabilities from the training data.</w:t>
       </w:r>
     </w:p>
-    <w:bookmarkEnd w:id="45"/>
-    <w:bookmarkStart w:id="46" w:name="X00c0de1c7e17744dc5a88898db48223675d398c"/>
+    <w:bookmarkEnd w:id="46"/>
+    <w:bookmarkStart w:id="47" w:name="X00c0de1c7e17744dc5a88898db48223675d398c"/>
     <w:p>
       <w:pPr>
         <w:pStyle w:val="Heading2"/>
@@ -8194,8 +8213,8 @@
         </w:tc>
       </w:tr>
     </w:tbl>
-    <w:bookmarkEnd w:id="46"/>
-    <w:bookmarkStart w:id="47" w:name="X9649a959629c788cf6908cc2f248996c3898fd3"/>
+    <w:bookmarkEnd w:id="47"/>
+    <w:bookmarkStart w:id="48" w:name="X9649a959629c788cf6908cc2f248996c3898fd3"/>
     <w:p>
       <w:pPr>
         <w:pStyle w:val="Heading2"/>
@@ -8372,8 +8391,8 @@
         <w:t xml:space="preserve">suggested range with evidence, not for an automatic price.</w:t>
       </w:r>
     </w:p>
-    <w:bookmarkEnd w:id="47"/>
-    <w:bookmarkStart w:id="48" w:name="Xce49d8f8d18e140ced2c7896668a64ee3f5867b"/>
+    <w:bookmarkEnd w:id="48"/>
+    <w:bookmarkStart w:id="49" w:name="Xce49d8f8d18e140ced2c7896668a64ee3f5867b"/>
     <w:p>
       <w:pPr>
         <w:pStyle w:val="Heading2"/>
@@ -8537,7 +8556,7 @@
       <w:r>
         <w:t xml:space="preserve"> </w:t>
       </w:r>
-      <w:hyperlink r:id="rId16">
+      <w:hyperlink r:id="rId17">
         <w:r>
           <w:rPr>
             <w:rStyle w:val="Hyperlink"/>
@@ -8549,8 +8568,8 @@
         <w:t xml:space="preserve">).</w:t>
       </w:r>
     </w:p>
-    <w:bookmarkEnd w:id="48"/>
-    <w:bookmarkStart w:id="53" w:name="X78f60d2c5719dda982d90470cd184b8c123b4bc"/>
+    <w:bookmarkEnd w:id="49"/>
+    <w:bookmarkStart w:id="54" w:name="X78f60d2c5719dda982d90470cd184b8c123b4bc"/>
     <w:p>
       <w:pPr>
         <w:pStyle w:val="Heading2"/>
@@ -8614,7 +8633,7 @@
             <w:pPr>
               <w:pStyle w:val="Compact"/>
             </w:pPr>
-            <w:hyperlink r:id="rId49">
+            <w:hyperlink r:id="rId50">
               <w:r>
                 <w:rPr>
                   <w:rStyle w:val="Hyperlink"/>
@@ -8628,7 +8647,7 @@
             <w:r>
               <w:t xml:space="preserve"> </w:t>
             </w:r>
-            <w:hyperlink r:id="rId50">
+            <w:hyperlink r:id="rId51">
               <w:r>
                 <w:rPr>
                   <w:rStyle w:val="Hyperlink"/>
@@ -8657,7 +8676,7 @@
             <w:pPr>
               <w:pStyle w:val="Compact"/>
             </w:pPr>
-            <w:hyperlink r:id="rId16">
+            <w:hyperlink r:id="rId17">
               <w:r>
                 <w:rPr>
                   <w:rStyle w:val="Hyperlink"/>
@@ -8698,7 +8717,7 @@
             <w:pPr>
               <w:pStyle w:val="Compact"/>
             </w:pPr>
-            <w:hyperlink r:id="rId14">
+            <w:hyperlink r:id="rId15">
               <w:r>
                 <w:rPr>
                   <w:rStyle w:val="Hyperlink"/>
@@ -8865,7 +8884,7 @@
             <w:pPr>
               <w:pStyle w:val="Compact"/>
             </w:pPr>
-            <w:hyperlink r:id="rId51">
+            <w:hyperlink r:id="rId52">
               <w:r>
                 <w:rPr>
                   <w:rStyle w:val="Hyperlink"/>
@@ -8894,7 +8913,7 @@
             <w:pPr>
               <w:pStyle w:val="Compact"/>
             </w:pPr>
-            <w:hyperlink r:id="rId52">
+            <w:hyperlink r:id="rId53">
               <w:r>
                 <w:rPr>
                   <w:rStyle w:val="Hyperlink"/>
@@ -8912,8 +8931,1510 @@
         </w:tc>
       </w:tr>
     </w:tbl>
-    <w:bookmarkEnd w:id="53"/>
     <w:bookmarkEnd w:id="54"/>
+    <w:bookmarkStart w:id="68" w:name="X023d193c052f09c34c1976a793e1a3bf644b264"/>
+    <w:p>
+      <w:pPr>
+        <w:pStyle w:val="Heading2"/>
+      </w:pPr>
+      <w:r>
+        <w:t xml:space="preserve">17. Related work</w:t>
+      </w:r>
+    </w:p>
+    <w:p>
+      <w:pPr>
+        <w:pStyle w:val="FirstParagraph"/>
+      </w:pPr>
+      <w:r>
+        <w:t xml:space="preserve">Six papers were read in full; the PDFs are kept locally in</w:t>
+      </w:r>
+      <w:r>
+        <w:t xml:space="preserve"> </w:t>
+      </w:r>
+      <w:r>
+        <w:rPr>
+          <w:rStyle w:val="VerbatimChar"/>
+        </w:rPr>
+        <w:t xml:space="preserve">ml_price/research_papers/</w:t>
+      </w:r>
+      <w:r>
+        <w:t xml:space="preserve"> </w:t>
+      </w:r>
+      <w:r>
+        <w:t xml:space="preserve">(index in</w:t>
+      </w:r>
+      <w:r>
+        <w:t xml:space="preserve"> </w:t>
+      </w:r>
+      <w:r>
+        <w:t xml:space="preserve">its</w:t>
+      </w:r>
+      <w:r>
+        <w:t xml:space="preserve"> </w:t>
+      </w:r>
+      <w:hyperlink r:id="rId55">
+        <w:r>
+          <w:rPr>
+            <w:rStyle w:val="Hyperlink"/>
+          </w:rPr>
+          <w:t xml:space="preserve">README</w:t>
+        </w:r>
+      </w:hyperlink>
+      <w:r>
+        <w:t xml:space="preserve">). Four more are listed from their abstracts only, and</w:t>
+      </w:r>
+      <w:r>
+        <w:t xml:space="preserve"> </w:t>
+      </w:r>
+      <w:r>
+        <w:t xml:space="preserve">are marked as such.</w:t>
+      </w:r>
+    </w:p>
+    <w:bookmarkStart w:id="56" w:name="X4dce9fc72563e96493deb9e7f0c4795cd424abc"/>
+    <w:p>
+      <w:pPr>
+        <w:pStyle w:val="Heading3"/>
+      </w:pPr>
+      <w:r>
+        <w:t xml:space="preserve">17.1 How this project relates to each paper</w:t>
+      </w:r>
+    </w:p>
+    <w:tbl>
+      <w:tblPr>
+        <w:tblStyle w:val="Table"/>
+        <w:tblW w:type="auto" w:w="0"/>
+        <w:tblLook w:firstRow="1" w:lastRow="0" w:firstColumn="0" w:lastColumn="0" w:noHBand="0" w:noVBand="0" w:val="0020"/>
+      </w:tblPr>
+      <w:tblGrid>
+        <w:gridCol w:w="1584"/>
+        <w:gridCol w:w="1584"/>
+        <w:gridCol w:w="1584"/>
+        <w:gridCol w:w="1584"/>
+        <w:gridCol w:w="1584"/>
+      </w:tblGrid>
+      <w:tr>
+        <w:trPr>
+          <w:tblHeader w:val="on"/>
+        </w:trPr>
+        <w:tc>
+          <w:tcPr/>
+          <w:p>
+            <w:pPr>
+              <w:pStyle w:val="Compact"/>
+            </w:pPr>
+            <w:r>
+              <w:t xml:space="preserve">#</w:t>
+            </w:r>
+          </w:p>
+        </w:tc>
+        <w:tc>
+          <w:tcPr/>
+          <w:p>
+            <w:pPr>
+              <w:pStyle w:val="Compact"/>
+            </w:pPr>
+            <w:r>
+              <w:t xml:space="preserve">Paper</w:t>
+            </w:r>
+          </w:p>
+        </w:tc>
+        <w:tc>
+          <w:tcPr/>
+          <w:p>
+            <w:pPr>
+              <w:pStyle w:val="Compact"/>
+            </w:pPr>
+            <w:r>
+              <w:t xml:space="preserve">What they did</w:t>
+            </w:r>
+          </w:p>
+        </w:tc>
+        <w:tc>
+          <w:tcPr/>
+          <w:p>
+            <w:pPr>
+              <w:pStyle w:val="Compact"/>
+            </w:pPr>
+            <w:r>
+              <w:t xml:space="preserve">Same as this project</w:t>
+            </w:r>
+          </w:p>
+        </w:tc>
+        <w:tc>
+          <w:tcPr/>
+          <w:p>
+            <w:pPr>
+              <w:pStyle w:val="Compact"/>
+            </w:pPr>
+            <w:r>
+              <w:t xml:space="preserve">Where this project differs</w:t>
+            </w:r>
+          </w:p>
+        </w:tc>
+      </w:tr>
+      <w:tr>
+        <w:tc>
+          <w:tcPr/>
+          <w:p>
+            <w:pPr>
+              <w:pStyle w:val="Compact"/>
+            </w:pPr>
+            <w:r>
+              <w:t xml:space="preserve">[1]</w:t>
+            </w:r>
+          </w:p>
+        </w:tc>
+        <w:tc>
+          <w:tcPr/>
+          <w:p>
+            <w:pPr>
+              <w:pStyle w:val="Compact"/>
+            </w:pPr>
+            <w:r>
+              <w:t xml:space="preserve">Wang et al.,</w:t>
+            </w:r>
+            <w:r>
+              <w:t xml:space="preserve"> </w:t>
+            </w:r>
+            <w:r>
+              <w:rPr>
+                <w:b/>
+                <w:bCs/>
+              </w:rPr>
+              <w:t xml:space="preserve">LLP: LLM-Based Product Pricing in E-commerce</w:t>
+            </w:r>
+            <w:r>
+              <w:t xml:space="preserve"> </w:t>
+            </w:r>
+            <w:r>
+              <w:t xml:space="preserve">(Alibaba Xianyu, arXiv 2025)</w:t>
+            </w:r>
+          </w:p>
+        </w:tc>
+        <w:tc>
+          <w:tcPr/>
+          <w:p>
+            <w:pPr>
+              <w:pStyle w:val="Compact"/>
+            </w:pPr>
+            <w:r>
+              <w:t xml:space="preserve">Retrieve comparable listings, then an LLM (fine-tuned with SFT + GRPO) writes a price with reasoning; low-confidence answers filtered out. Deployed; seller adoption of suggestions 40% → 72%</w:t>
+            </w:r>
+          </w:p>
+        </w:tc>
+        <w:tc>
+          <w:tcPr/>
+          <w:p>
+            <w:pPr>
+              <w:pStyle w:val="Compact"/>
+            </w:pPr>
+            <w:r>
+              <w:rPr>
+                <w:b/>
+                <w:bCs/>
+              </w:rPr>
+              <w:t xml:space="preserve">Part 18 RAG</w:t>
+            </w:r>
+            <w:r>
+              <w:t xml:space="preserve"> </w:t>
+            </w:r>
+            <w:r>
+              <w:t xml:space="preserve">uses the same retrieve-then-generate design; Part 11 FAISS retrieval</w:t>
+            </w:r>
+          </w:p>
+        </w:tc>
+        <w:tc>
+          <w:tcPr/>
+          <w:p>
+            <w:pPr>
+              <w:pStyle w:val="Compact"/>
+            </w:pPr>
+            <w:r>
+              <w:t xml:space="preserve">No fine-tuning, so the LLM is only prompted. Measured against a trained regressor on unseen families: RAG R² 0.73 vs Ridge 0.85, so here RAG explains prices and does not set them</w:t>
+            </w:r>
+          </w:p>
+        </w:tc>
+      </w:tr>
+      <w:tr>
+        <w:tc>
+          <w:tcPr/>
+          <w:p>
+            <w:pPr>
+              <w:pStyle w:val="Compact"/>
+            </w:pPr>
+            <w:r>
+              <w:t xml:space="preserve">[2]</w:t>
+            </w:r>
+          </w:p>
+        </w:tc>
+        <w:tc>
+          <w:tcPr/>
+          <w:p>
+            <w:pPr>
+              <w:pStyle w:val="Compact"/>
+            </w:pPr>
+            <w:r>
+              <w:t xml:space="preserve">Sartipi et al.,</w:t>
+            </w:r>
+            <w:r>
+              <w:t xml:space="preserve"> </w:t>
+            </w:r>
+            <w:r>
+              <w:rPr>
+                <w:b/>
+                <w:bCs/>
+              </w:rPr>
+              <w:t xml:space="preserve">A Modular LLM Framework for Explainable Price Outlier Detection</w:t>
+            </w:r>
+            <w:r>
+              <w:t xml:space="preserve"> </w:t>
+            </w:r>
+            <w:r>
+              <w:t xml:space="preserve">(Amazon, ICLR 2026 workshop)</w:t>
+            </w:r>
+          </w:p>
+        </w:tc>
+        <w:tc>
+          <w:tcPr/>
+          <w:p>
+            <w:pPr>
+              <w:pStyle w:val="Compact"/>
+            </w:pPr>
+            <w:r>
+              <w:t xml:space="preserve">Find comparable products, compare on price-relevant attributes, LLM decides if a price is an outlier, with reasons. &gt; 75% agreement with human auditors; beats zero-shot and plain-retrieval LLMs</w:t>
+            </w:r>
+          </w:p>
+        </w:tc>
+        <w:tc>
+          <w:tcPr/>
+          <w:p>
+            <w:pPr>
+              <w:pStyle w:val="Compact"/>
+            </w:pPr>
+            <w:r>
+              <w:rPr>
+                <w:b/>
+                <w:bCs/>
+              </w:rPr>
+              <w:t xml:space="preserve">Part 7</w:t>
+            </w:r>
+            <w:r>
+              <w:t xml:space="preserve"> </w:t>
+            </w:r>
+            <w:r>
+              <w:t xml:space="preserve">underpricing detector;</w:t>
+            </w:r>
+            <w:r>
+              <w:t xml:space="preserve"> </w:t>
+            </w:r>
+            <w:r>
+              <w:rPr>
+                <w:b/>
+                <w:bCs/>
+              </w:rPr>
+              <w:t xml:space="preserve">Part 16</w:t>
+            </w:r>
+            <w:r>
+              <w:t xml:space="preserve"> </w:t>
+            </w:r>
+            <w:r>
+              <w:t xml:space="preserve">advisor cautions; both stress explainable flags. They also list Isolation Forest as a classical baseline, used in step 2.9</w:t>
+            </w:r>
+          </w:p>
+        </w:tc>
+        <w:tc>
+          <w:tcPr/>
+          <w:p>
+            <w:pPr>
+              <w:pStyle w:val="Compact"/>
+            </w:pPr>
+            <w:r>
+              <w:t xml:space="preserve">Ours is a model-residual detector (flag if actual &lt; 50% of expected) treated as a review queue. Their staged LLM comparison is a possible upgrade</w:t>
+            </w:r>
+          </w:p>
+        </w:tc>
+      </w:tr>
+      <w:tr>
+        <w:tc>
+          <w:tcPr/>
+          <w:p>
+            <w:pPr>
+              <w:pStyle w:val="Compact"/>
+            </w:pPr>
+            <w:r>
+              <w:t xml:space="preserve">[3]</w:t>
+            </w:r>
+          </w:p>
+        </w:tc>
+        <w:tc>
+          <w:tcPr/>
+          <w:p>
+            <w:pPr>
+              <w:pStyle w:val="Compact"/>
+            </w:pPr>
+            <w:r>
+              <w:t xml:space="preserve">Singh,</w:t>
+            </w:r>
+            <w:r>
+              <w:t xml:space="preserve"> </w:t>
+            </w:r>
+            <w:r>
+              <w:rPr>
+                <w:b/>
+                <w:bCs/>
+              </w:rPr>
+              <w:t xml:space="preserve">A Multimodal, Multitask System for Generating E-Commerce Text Listings from Images</w:t>
+            </w:r>
+            <w:r>
+              <w:t xml:space="preserve"> </w:t>
+            </w:r>
+            <w:r>
+              <w:t xml:space="preserve">(arXiv 2025)</w:t>
+            </w:r>
+          </w:p>
+        </w:tc>
+        <w:tc>
+          <w:tcPr/>
+          <w:p>
+            <w:pPr>
+              <w:pStyle w:val="Compact"/>
+            </w:pPr>
+            <w:r>
+              <w:t xml:space="preserve">One vision encoder trained jointly on attributes and price for 14.2k clothing listings; multitask gives +3.6% R² over price alone</w:t>
+            </w:r>
+          </w:p>
+        </w:tc>
+        <w:tc>
+          <w:tcPr/>
+          <w:p>
+            <w:pPr>
+              <w:pStyle w:val="Compact"/>
+            </w:pPr>
+            <w:r>
+              <w:rPr>
+                <w:b/>
+                <w:bCs/>
+              </w:rPr>
+              <w:t xml:space="preserve">Part 13</w:t>
+            </w:r>
+            <w:r>
+              <w:t xml:space="preserve">: photos carry price signal (photos alone R² 0.375; +0.016 test R² on top of text)</w:t>
+            </w:r>
+          </w:p>
+        </w:tc>
+        <w:tc>
+          <w:tcPr/>
+          <w:p>
+            <w:pPr>
+              <w:pStyle w:val="Compact"/>
+            </w:pPr>
+            <w:r>
+              <w:t xml:space="preserve">We use a frozen pretrained CNN (SqueezeNet, transfer learning), no fine-tuning, and combine it with text, KG and LLM features</w:t>
+            </w:r>
+          </w:p>
+        </w:tc>
+      </w:tr>
+      <w:tr>
+        <w:tc>
+          <w:tcPr/>
+          <w:p>
+            <w:pPr>
+              <w:pStyle w:val="Compact"/>
+            </w:pPr>
+            <w:r>
+              <w:t xml:space="preserve">[4]</w:t>
+            </w:r>
+          </w:p>
+        </w:tc>
+        <w:tc>
+          <w:tcPr/>
+          <w:p>
+            <w:pPr>
+              <w:pStyle w:val="Compact"/>
+            </w:pPr>
+            <w:r>
+              <w:t xml:space="preserve">Thejaswini, Priyadarshini &amp; Hareesh,</w:t>
+            </w:r>
+            <w:r>
+              <w:t xml:space="preserve"> </w:t>
+            </w:r>
+            <w:r>
+              <w:rPr>
+                <w:b/>
+                <w:bCs/>
+              </w:rPr>
+              <w:t xml:space="preserve">A Smart E-Commerce Platform for Handmade Crafts with AI-Based Price Recommendation for Sellers</w:t>
+            </w:r>
+            <w:r>
+              <w:t xml:space="preserve"> </w:t>
+            </w:r>
+            <w:r>
+              <w:t xml:space="preserve">(IJERT, Vol. 14, Issue 01)</w:t>
+            </w:r>
+          </w:p>
+        </w:tc>
+        <w:tc>
+          <w:tcPr/>
+          <w:p>
+            <w:pPr>
+              <w:pStyle w:val="Compact"/>
+            </w:pPr>
+            <w:r>
+              <w:t xml:space="preserve">Linear regression + TF-IDF and cosine similarity on handmade product descriptions, served to a seller dashboard; reports "about 80% accuracy"</w:t>
+            </w:r>
+          </w:p>
+        </w:tc>
+        <w:tc>
+          <w:tcPr/>
+          <w:p>
+            <w:pPr>
+              <w:pStyle w:val="Compact"/>
+            </w:pPr>
+            <w:r>
+              <w:t xml:space="preserve">Closest in</w:t>
+            </w:r>
+            <w:r>
+              <w:t xml:space="preserve"> </w:t>
+            </w:r>
+            <w:r>
+              <w:rPr>
+                <w:b/>
+                <w:bCs/>
+              </w:rPr>
+              <w:t xml:space="preserve">goal and method</w:t>
+            </w:r>
+            <w:r>
+              <w:t xml:space="preserve">: handmade products, TF-IDF text, a linear model, a seller-facing advisor (Parts 8, 11, 16)</w:t>
+            </w:r>
+          </w:p>
+        </w:tc>
+        <w:tc>
+          <w:tcPr/>
+          <w:p>
+            <w:pPr>
+              <w:pStyle w:val="Compact"/>
+            </w:pPr>
+            <w:r>
+              <w:t xml:space="preserve">Their dataset</w:t>
+            </w:r>
+            <w:r>
+              <w:t xml:space="preserve"> </w:t>
+            </w:r>
+            <w:r>
+              <w:rPr>
+                <w:b/>
+                <w:bCs/>
+              </w:rPr>
+              <w:t xml:space="preserve">simulates</w:t>
+            </w:r>
+            <w:r>
+              <w:t xml:space="preserve"> </w:t>
+            </w:r>
+            <w:r>
+              <w:t xml:space="preserve">handmade products; ours is 37,257 real listings. Their metric is a single "accuracy"; ours is R², MAE, MAPE and band F1 on a family-grouped test set, plus a fair-wage floor</w:t>
+            </w:r>
+          </w:p>
+        </w:tc>
+      </w:tr>
+      <w:tr>
+        <w:tc>
+          <w:tcPr/>
+          <w:p>
+            <w:pPr>
+              <w:pStyle w:val="Compact"/>
+            </w:pPr>
+            <w:r>
+              <w:t xml:space="preserve">[5]</w:t>
+            </w:r>
+          </w:p>
+        </w:tc>
+        <w:tc>
+          <w:tcPr/>
+          <w:p>
+            <w:pPr>
+              <w:pStyle w:val="Compact"/>
+            </w:pPr>
+            <w:r>
+              <w:t xml:space="preserve">Ranganathan,</w:t>
+            </w:r>
+            <w:r>
+              <w:t xml:space="preserve"> </w:t>
+            </w:r>
+            <w:r>
+              <w:rPr>
+                <w:b/>
+                <w:bCs/>
+              </w:rPr>
+              <w:t xml:space="preserve">The Artisan and His Audience: Identification with Work and Price-Setting in a Handicraft Cluster in Southern India</w:t>
+            </w:r>
+            <w:r>
+              <w:t xml:space="preserve"> </w:t>
+            </w:r>
+            <w:r>
+              <w:t xml:space="preserve">(Stanford King Center WP 560, 2015)</w:t>
+            </w:r>
+          </w:p>
+        </w:tc>
+        <w:tc>
+          <w:tcPr/>
+          <w:p>
+            <w:pPr>
+              <w:pStyle w:val="Compact"/>
+            </w:pPr>
+            <w:r>
+              <w:t xml:space="preserve">Field audit of 77 sellers (52 artisans, 25 traders) in Channapatna, Karnataka, 455 visits: artisans who identify with their work give discerning buyers discounts</w:t>
+            </w:r>
+          </w:p>
+        </w:tc>
+        <w:tc>
+          <w:tcPr/>
+          <w:p>
+            <w:pPr>
+              <w:pStyle w:val="Compact"/>
+            </w:pPr>
+            <w:r>
+              <w:rPr>
+                <w:b/>
+                <w:bCs/>
+              </w:rPr>
+              <w:t xml:space="preserve">Motivation and ethics (Part 15)</w:t>
+            </w:r>
+            <w:r>
+              <w:t xml:space="preserve">: artisans' prices are not purely economic, so market data can carry under-pricing</w:t>
+            </w:r>
+          </w:p>
+        </w:tc>
+        <w:tc>
+          <w:tcPr/>
+          <w:p>
+            <w:pPr>
+              <w:pStyle w:val="Compact"/>
+            </w:pPr>
+            <w:r>
+              <w:t xml:space="preserve">We treat this as the reason the model may never set a floor: the advisor applies the app's fair-wage floor above the market estimate</w:t>
+            </w:r>
+          </w:p>
+        </w:tc>
+      </w:tr>
+      <w:tr>
+        <w:tc>
+          <w:tcPr/>
+          <w:p>
+            <w:pPr>
+              <w:pStyle w:val="Compact"/>
+            </w:pPr>
+            <w:r>
+              <w:t xml:space="preserve">[6]</w:t>
+            </w:r>
+          </w:p>
+        </w:tc>
+        <w:tc>
+          <w:tcPr/>
+          <w:p>
+            <w:pPr>
+              <w:pStyle w:val="Compact"/>
+            </w:pPr>
+            <w:r>
+              <w:t xml:space="preserve">Jiang,</w:t>
+            </w:r>
+            <w:r>
+              <w:t xml:space="preserve"> </w:t>
+            </w:r>
+            <w:r>
+              <w:rPr>
+                <w:b/>
+                <w:bCs/>
+              </w:rPr>
+              <w:t xml:space="preserve">Effective e-commerce price prediction with machine learning technologies</w:t>
+            </w:r>
+            <w:r>
+              <w:t xml:space="preserve"> </w:t>
+            </w:r>
+            <w:r>
+              <w:t xml:space="preserve">(ASENS 2024, ACM)</w:t>
+            </w:r>
+          </w:p>
+        </w:tc>
+        <w:tc>
+          <w:tcPr/>
+          <w:p>
+            <w:pPr>
+              <w:pStyle w:val="Compact"/>
+            </w:pPr>
+            <w:r>
+              <w:t xml:space="preserve">8 ML models on two small Kaggle datasets (1,199 and 1,465 rows), random 70/30 split, Bayesian optimisation; Random Forest best; sentiment features did not help</w:t>
+            </w:r>
+          </w:p>
+        </w:tc>
+        <w:tc>
+          <w:tcPr/>
+          <w:p>
+            <w:pPr>
+              <w:pStyle w:val="Compact"/>
+            </w:pPr>
+            <w:r>
+              <w:rPr>
+                <w:b/>
+                <w:bCs/>
+              </w:rPr>
+              <w:t xml:space="preserve">Part 8</w:t>
+            </w:r>
+            <w:r>
+              <w:t xml:space="preserve"> </w:t>
+            </w:r>
+            <w:r>
+              <w:t xml:space="preserve">also compares 8 regressors with tuning</w:t>
+            </w:r>
+          </w:p>
+        </w:tc>
+        <w:tc>
+          <w:tcPr/>
+          <w:p>
+            <w:pPr>
+              <w:pStyle w:val="Compact"/>
+            </w:pPr>
+            <w:r>
+              <w:t xml:space="preserve">They split randomly; this project found a random-style split inflates R² (0.86 vs honest v3) because of near-copy listings. Our winner is Ridge, because our main features are thousands of sparse words</w:t>
+            </w:r>
+          </w:p>
+        </w:tc>
+      </w:tr>
+    </w:tbl>
+    <w:bookmarkEnd w:id="56"/>
+    <w:bookmarkStart w:id="57" w:name="X722b4ff52f8f7f8ce7296c316021241bba18ba3"/>
+    <w:p>
+      <w:pPr>
+        <w:pStyle w:val="Heading3"/>
+      </w:pPr>
+      <w:r>
+        <w:t xml:space="preserve">17.2 Also relevant (abstract only, not read in full)</w:t>
+      </w:r>
+    </w:p>
+    <w:p>
+      <w:pPr>
+        <w:pStyle w:val="Compact"/>
+        <w:numPr>
+          <w:ilvl w:val="0"/>
+          <w:numId w:val="1023"/>
+        </w:numPr>
+      </w:pPr>
+      <w:r>
+        <w:t xml:space="preserve">[7]</w:t>
+      </w:r>
+      <w:r>
+        <w:t xml:space="preserve"> </w:t>
+      </w:r>
+      <w:r>
+        <w:rPr>
+          <w:b/>
+          <w:bCs/>
+        </w:rPr>
+        <w:t xml:space="preserve">Optimizing Handloom Price Prediction: Leveraging Diverse Features for Superior Accuracy</w:t>
+      </w:r>
+      <w:r>
+        <w:rPr>
+          <w:b/>
+          <w:bCs/>
+        </w:rPr>
+        <w:t xml:space="preserve"> </w:t>
+      </w:r>
+      <w:r>
+        <w:rPr>
+          <w:b/>
+          <w:bCs/>
+        </w:rPr>
+        <w:t xml:space="preserve">Using Machine Learning</w:t>
+      </w:r>
+      <w:r>
+        <w:t xml:space="preserve"> </w:t>
+      </w:r>
+      <w:r>
+        <w:t xml:space="preserve">(Springer chapter, DOI 10.1007/978-3-032-06198-0_7; paywalled). Decision</w:t>
+      </w:r>
+      <w:r>
+        <w:t xml:space="preserve"> </w:t>
+      </w:r>
+      <w:r>
+        <w:t xml:space="preserve">Tree regression on handloom features (fabric, size, colour, design). Closest</w:t>
+      </w:r>
+      <w:r>
+        <w:t xml:space="preserve"> </w:t>
+      </w:r>
+      <w:r>
+        <w:rPr>
+          <w:i/>
+          <w:iCs/>
+        </w:rPr>
+        <w:t xml:space="preserve">domain</w:t>
+      </w:r>
+      <w:r>
+        <w:t xml:space="preserve"> </w:t>
+      </w:r>
+      <w:r>
+        <w:t xml:space="preserve">match; in</w:t>
+      </w:r>
+      <w:r>
+        <w:t xml:space="preserve"> </w:t>
+      </w:r>
+      <w:r>
+        <w:t xml:space="preserve">this project a single Decision Tree scored R² 0.413 against Ridge 0.748 (Part 8).</w:t>
+      </w:r>
+    </w:p>
+    <w:p>
+      <w:pPr>
+        <w:pStyle w:val="Compact"/>
+        <w:numPr>
+          <w:ilvl w:val="0"/>
+          <w:numId w:val="1023"/>
+        </w:numPr>
+      </w:pPr>
+      <w:r>
+        <w:t xml:space="preserve">[8]</w:t>
+      </w:r>
+      <w:r>
+        <w:t xml:space="preserve"> </w:t>
+      </w:r>
+      <w:r>
+        <w:rPr>
+          <w:b/>
+          <w:bCs/>
+        </w:rPr>
+        <w:t xml:space="preserve">A multimodal deep learning framework for integrating visual, textual and categorical</w:t>
+      </w:r>
+      <w:r>
+        <w:rPr>
+          <w:b/>
+          <w:bCs/>
+        </w:rPr>
+        <w:t xml:space="preserve"> </w:t>
+      </w:r>
+      <w:r>
+        <w:rPr>
+          <w:b/>
+          <w:bCs/>
+        </w:rPr>
+        <w:t xml:space="preserve">features in retail price estimation</w:t>
+      </w:r>
+      <w:r>
+        <w:t xml:space="preserve">,</w:t>
+      </w:r>
+      <w:r>
+        <w:t xml:space="preserve"> </w:t>
+      </w:r>
+      <w:r>
+        <w:rPr>
+          <w:i/>
+          <w:iCs/>
+        </w:rPr>
+        <w:t xml:space="preserve">Array</w:t>
+      </w:r>
+      <w:r>
+        <w:t xml:space="preserve">, 2025 (DOI 10.1016/j.array.2025.100565; open</w:t>
+      </w:r>
+      <w:r>
+        <w:t xml:space="preserve"> </w:t>
+      </w:r>
+      <w:r>
+        <w:t xml:space="preserve">access). EfficientNet images + BiLSTM text + categorical embeddings, late fusion. Same input mix</w:t>
+      </w:r>
+      <w:r>
+        <w:t xml:space="preserve"> </w:t>
+      </w:r>
+      <w:r>
+        <w:t xml:space="preserve">as stage S12-img.</w:t>
+      </w:r>
+    </w:p>
+    <w:p>
+      <w:pPr>
+        <w:pStyle w:val="Compact"/>
+        <w:numPr>
+          <w:ilvl w:val="0"/>
+          <w:numId w:val="1023"/>
+        </w:numPr>
+      </w:pPr>
+      <w:r>
+        <w:t xml:space="preserve">[9] Ait Si Ali, Seker, Farnie &amp; Elliott,</w:t>
+      </w:r>
+      <w:r>
+        <w:t xml:space="preserve"> </w:t>
+      </w:r>
+      <w:r>
+        <w:rPr>
+          <w:b/>
+          <w:bCs/>
+        </w:rPr>
+        <w:t xml:space="preserve">Extensive Data Exploration for Automatic Price</w:t>
+      </w:r>
+      <w:r>
+        <w:rPr>
+          <w:b/>
+          <w:bCs/>
+        </w:rPr>
+        <w:t xml:space="preserve"> </w:t>
+      </w:r>
+      <w:r>
+        <w:rPr>
+          <w:b/>
+          <w:bCs/>
+        </w:rPr>
+        <w:t xml:space="preserve">Suggestion Using Item Description: Case Study for the Kaggle Mercari Challenge</w:t>
+      </w:r>
+      <w:r>
+        <w:t xml:space="preserve">, ICAAI 2018.</w:t>
+      </w:r>
+      <w:r>
+        <w:t xml:space="preserve"> </w:t>
+      </w:r>
+      <w:r>
+        <w:t xml:space="preserve">Price from listing text; the challenge scores RMSLE, i.e. error on log price, as our target does.</w:t>
+      </w:r>
+    </w:p>
+    <w:p>
+      <w:pPr>
+        <w:pStyle w:val="Compact"/>
+        <w:numPr>
+          <w:ilvl w:val="0"/>
+          <w:numId w:val="1023"/>
+        </w:numPr>
+      </w:pPr>
+      <w:r>
+        <w:t xml:space="preserve">[10]</w:t>
+      </w:r>
+      <w:r>
+        <w:t xml:space="preserve"> </w:t>
+      </w:r>
+      <w:r>
+        <w:rPr>
+          <w:b/>
+          <w:bCs/>
+        </w:rPr>
+        <w:t xml:space="preserve">The Role of Social Media and Product Differentiation in Etsy Micro-Manufacturing Shops</w:t>
+      </w:r>
+      <w:r>
+        <w:t xml:space="preserve">,</w:t>
+      </w:r>
+      <w:r>
+        <w:t xml:space="preserve"> </w:t>
+      </w:r>
+      <w:r>
+        <w:t xml:space="preserve">SAIS 2017. 1,386 Etsy sellers: handmade / customised differentiation goes with higher prices.</w:t>
+      </w:r>
+    </w:p>
+    <w:bookmarkEnd w:id="57"/>
+    <w:bookmarkStart w:id="58" w:name="X095e8fa777044c94a56d406371a347249637d68"/>
+    <w:p>
+      <w:pPr>
+        <w:pStyle w:val="Heading3"/>
+      </w:pPr>
+      <w:r>
+        <w:t xml:space="preserve">17.3 What this project adds</w:t>
+      </w:r>
+    </w:p>
+    <w:p>
+      <w:pPr>
+        <w:pStyle w:val="Compact"/>
+        <w:numPr>
+          <w:ilvl w:val="0"/>
+          <w:numId w:val="1024"/>
+        </w:numPr>
+      </w:pPr>
+      <w:r>
+        <w:rPr>
+          <w:b/>
+          <w:bCs/>
+        </w:rPr>
+        <w:t xml:space="preserve">Honest evaluation on unseen product families.</w:t>
+      </w:r>
+      <w:r>
+        <w:t xml:space="preserve"> </w:t>
+      </w:r>
+      <w:r>
+        <w:t xml:space="preserve">None of the papers read in full checks for</w:t>
+      </w:r>
+      <w:r>
+        <w:t xml:space="preserve"> </w:t>
+      </w:r>
+      <w:r>
+        <w:t xml:space="preserve">near-duplicate listings across train and test; [6] uses a random split. Here, grouping by</w:t>
+      </w:r>
+      <w:r>
+        <w:t xml:space="preserve"> </w:t>
+      </w:r>
+      <w:r>
+        <w:t xml:space="preserve">family changed the conclusion (R² 0.86 → realistic scores).</w:t>
+      </w:r>
+    </w:p>
+    <w:p>
+      <w:pPr>
+        <w:pStyle w:val="Compact"/>
+        <w:numPr>
+          <w:ilvl w:val="0"/>
+          <w:numId w:val="1024"/>
+        </w:numPr>
+      </w:pPr>
+      <w:r>
+        <w:rPr>
+          <w:b/>
+          <w:bCs/>
+        </w:rPr>
+        <w:t xml:space="preserve">A craft knowledge graph with rule reasoning</w:t>
+      </w:r>
+      <w:r>
+        <w:t xml:space="preserve"> </w:t>
+      </w:r>
+      <w:r>
+        <w:t xml:space="preserve">(OWL + SWRL + HermiT) as a feature source and as</w:t>
+      </w:r>
+      <w:r>
+        <w:t xml:space="preserve"> </w:t>
+      </w:r>
+      <w:r>
+        <w:t xml:space="preserve">the advisor's knowledge layer. No pricing paper found uses an ontology of crafts.</w:t>
+      </w:r>
+    </w:p>
+    <w:p>
+      <w:pPr>
+        <w:pStyle w:val="Compact"/>
+        <w:numPr>
+          <w:ilvl w:val="0"/>
+          <w:numId w:val="1024"/>
+        </w:numPr>
+      </w:pPr>
+      <w:r>
+        <w:rPr>
+          <w:b/>
+          <w:bCs/>
+        </w:rPr>
+        <w:t xml:space="preserve">A fair-wage floor that overrides the model</w:t>
+      </w:r>
+      <w:r>
+        <w:t xml:space="preserve">, motivated by [5] and by the family-level bias</w:t>
+      </w:r>
+      <w:r>
+        <w:t xml:space="preserve"> </w:t>
+      </w:r>
+      <w:r>
+        <w:t xml:space="preserve">audit. The other pricing systems ([1], [4], [6]) optimise toward market prices only.</w:t>
+      </w:r>
+    </w:p>
+    <w:p>
+      <w:pPr>
+        <w:pStyle w:val="Compact"/>
+        <w:numPr>
+          <w:ilvl w:val="0"/>
+          <w:numId w:val="1024"/>
+        </w:numPr>
+      </w:pPr>
+      <w:r>
+        <w:rPr>
+          <w:b/>
+          <w:bCs/>
+        </w:rPr>
+        <w:t xml:space="preserve">Real data at scale for Indian handicrafts</w:t>
+      </w:r>
+      <w:r>
+        <w:t xml:space="preserve">: 37,257 real listings, compared with [4]'s simulated</w:t>
+      </w:r>
+      <w:r>
+        <w:t xml:space="preserve"> </w:t>
+      </w:r>
+      <w:r>
+        <w:t xml:space="preserve">dataset.</w:t>
+      </w:r>
+    </w:p>
+    <w:bookmarkEnd w:id="58"/>
+    <w:bookmarkStart w:id="67" w:name="Xfdb2bace94cce24f0002499ea0489ffb842c2b1"/>
+    <w:p>
+      <w:pPr>
+        <w:pStyle w:val="Heading3"/>
+      </w:pPr>
+      <w:r>
+        <w:t xml:space="preserve">17.4 References</w:t>
+      </w:r>
+    </w:p>
+    <w:p>
+      <w:pPr>
+        <w:pStyle w:val="Compact"/>
+        <w:numPr>
+          <w:ilvl w:val="0"/>
+          <w:numId w:val="1025"/>
+        </w:numPr>
+      </w:pPr>
+      <w:r>
+        <w:t xml:space="preserve">H. Wang, S. You, Q. Zhang, X. Xie, S. Han, Y. Wu, F. Huang, J. Chen.</w:t>
+      </w:r>
+      <w:r>
+        <w:t xml:space="preserve"> </w:t>
+      </w:r>
+      <w:r>
+        <w:rPr>
+          <w:i/>
+          <w:iCs/>
+        </w:rPr>
+        <w:t xml:space="preserve">LLP: LLM-Based Product</w:t>
+      </w:r>
+      <w:r>
+        <w:rPr>
+          <w:i/>
+          <w:iCs/>
+        </w:rPr>
+        <w:t xml:space="preserve"> </w:t>
+      </w:r>
+      <w:r>
+        <w:rPr>
+          <w:i/>
+          <w:iCs/>
+        </w:rPr>
+        <w:t xml:space="preserve">Pricing in E-commerce.</w:t>
+      </w:r>
+      <w:r>
+        <w:t xml:space="preserve"> </w:t>
+      </w:r>
+      <w:r>
+        <w:t xml:space="preserve">arXiv:2510.09347, 2025.</w:t>
+      </w:r>
+      <w:r>
+        <w:t xml:space="preserve"> </w:t>
+      </w:r>
+      <w:hyperlink r:id="rId59">
+        <w:r>
+          <w:rPr>
+            <w:rStyle w:val="Hyperlink"/>
+          </w:rPr>
+          <w:t xml:space="preserve">https://arxiv.org/abs/2510.09347</w:t>
+        </w:r>
+      </w:hyperlink>
+    </w:p>
+    <w:p>
+      <w:pPr>
+        <w:pStyle w:val="Compact"/>
+        <w:numPr>
+          <w:ilvl w:val="0"/>
+          <w:numId w:val="1025"/>
+        </w:numPr>
+      </w:pPr>
+      <w:r>
+        <w:t xml:space="preserve">S. Sartipi, J. Wu, S. Ghotbi, N. Vedula, S. Malmasi.</w:t>
+      </w:r>
+      <w:r>
+        <w:t xml:space="preserve"> </w:t>
+      </w:r>
+      <w:r>
+        <w:rPr>
+          <w:i/>
+          <w:iCs/>
+        </w:rPr>
+        <w:t xml:space="preserve">A Modular LLM Framework for Explainable</w:t>
+      </w:r>
+      <w:r>
+        <w:rPr>
+          <w:i/>
+          <w:iCs/>
+        </w:rPr>
+        <w:t xml:space="preserve"> </w:t>
+      </w:r>
+      <w:r>
+        <w:rPr>
+          <w:i/>
+          <w:iCs/>
+        </w:rPr>
+        <w:t xml:space="preserve">Price Outlier Detection.</w:t>
+      </w:r>
+      <w:r>
+        <w:t xml:space="preserve"> </w:t>
+      </w:r>
+      <w:r>
+        <w:t xml:space="preserve">ICLR 2026 Workshop on Advances in Financial AI. arXiv:2603.20636.</w:t>
+      </w:r>
+      <w:r>
+        <w:t xml:space="preserve"> </w:t>
+      </w:r>
+      <w:hyperlink r:id="rId60">
+        <w:r>
+          <w:rPr>
+            <w:rStyle w:val="Hyperlink"/>
+          </w:rPr>
+          <w:t xml:space="preserve">https://arxiv.org/abs/2603.20636</w:t>
+        </w:r>
+      </w:hyperlink>
+    </w:p>
+    <w:p>
+      <w:pPr>
+        <w:pStyle w:val="Compact"/>
+        <w:numPr>
+          <w:ilvl w:val="0"/>
+          <w:numId w:val="1025"/>
+        </w:numPr>
+      </w:pPr>
+      <w:r>
+        <w:t xml:space="preserve">N. K. Singh.</w:t>
+      </w:r>
+      <w:r>
+        <w:t xml:space="preserve"> </w:t>
+      </w:r>
+      <w:r>
+        <w:rPr>
+          <w:i/>
+          <w:iCs/>
+        </w:rPr>
+        <w:t xml:space="preserve">A Multimodal, Multitask System for Generating E-Commerce Text Listings from</w:t>
+      </w:r>
+      <w:r>
+        <w:rPr>
+          <w:i/>
+          <w:iCs/>
+        </w:rPr>
+        <w:t xml:space="preserve"> </w:t>
+      </w:r>
+      <w:r>
+        <w:rPr>
+          <w:i/>
+          <w:iCs/>
+        </w:rPr>
+        <w:t xml:space="preserve">Images.</w:t>
+      </w:r>
+      <w:r>
+        <w:t xml:space="preserve"> </w:t>
+      </w:r>
+      <w:r>
+        <w:t xml:space="preserve">arXiv:2510.21835, 2025.</w:t>
+      </w:r>
+      <w:r>
+        <w:t xml:space="preserve"> </w:t>
+      </w:r>
+      <w:hyperlink r:id="rId61">
+        <w:r>
+          <w:rPr>
+            <w:rStyle w:val="Hyperlink"/>
+          </w:rPr>
+          <w:t xml:space="preserve">https://arxiv.org/abs/2510.21835</w:t>
+        </w:r>
+      </w:hyperlink>
+    </w:p>
+    <w:p>
+      <w:pPr>
+        <w:pStyle w:val="Compact"/>
+        <w:numPr>
+          <w:ilvl w:val="0"/>
+          <w:numId w:val="1025"/>
+        </w:numPr>
+      </w:pPr>
+      <w:r>
+        <w:t xml:space="preserve">Thejaswini, P. Priyadarshini, B. Hareesh.</w:t>
+      </w:r>
+      <w:r>
+        <w:t xml:space="preserve"> </w:t>
+      </w:r>
+      <w:r>
+        <w:rPr>
+          <w:i/>
+          <w:iCs/>
+        </w:rPr>
+        <w:t xml:space="preserve">A Smart E-Commerce Platform for Handmade Crafts with</w:t>
+      </w:r>
+      <w:r>
+        <w:rPr>
+          <w:i/>
+          <w:iCs/>
+        </w:rPr>
+        <w:t xml:space="preserve"> </w:t>
+      </w:r>
+      <w:r>
+        <w:rPr>
+          <w:i/>
+          <w:iCs/>
+        </w:rPr>
+        <w:t xml:space="preserve">AI-Based Price Recommendation for Sellers.</w:t>
+      </w:r>
+      <w:r>
+        <w:t xml:space="preserve"> </w:t>
+      </w:r>
+      <w:r>
+        <w:t xml:space="preserve">International Journal of Engineering Research &amp;</w:t>
+      </w:r>
+      <w:r>
+        <w:t xml:space="preserve"> </w:t>
+      </w:r>
+      <w:r>
+        <w:t xml:space="preserve">Technology (IJERT), Vol. 14, Issue 01 (IJERTCONV14IS010006).</w:t>
+      </w:r>
+      <w:r>
+        <w:t xml:space="preserve"> </w:t>
+      </w:r>
+      <w:hyperlink r:id="rId62">
+        <w:r>
+          <w:rPr>
+            <w:rStyle w:val="Hyperlink"/>
+          </w:rPr>
+          <w:t xml:space="preserve">https://www.ijert.org/research/IJERTCONV14IS010006.pdf</w:t>
+        </w:r>
+      </w:hyperlink>
+    </w:p>
+    <w:p>
+      <w:pPr>
+        <w:pStyle w:val="Compact"/>
+        <w:numPr>
+          <w:ilvl w:val="0"/>
+          <w:numId w:val="1025"/>
+        </w:numPr>
+      </w:pPr>
+      <w:r>
+        <w:t xml:space="preserve">A. Ranganathan.</w:t>
+      </w:r>
+      <w:r>
+        <w:t xml:space="preserve"> </w:t>
+      </w:r>
+      <w:r>
+        <w:rPr>
+          <w:i/>
+          <w:iCs/>
+        </w:rPr>
+        <w:t xml:space="preserve">The Artisan and His Audience: Identification with Work and Price-Setting in a</w:t>
+      </w:r>
+      <w:r>
+        <w:rPr>
+          <w:i/>
+          <w:iCs/>
+        </w:rPr>
+        <w:t xml:space="preserve"> </w:t>
+      </w:r>
+      <w:r>
+        <w:rPr>
+          <w:i/>
+          <w:iCs/>
+        </w:rPr>
+        <w:t xml:space="preserve">Handicraft Cluster in Southern India.</w:t>
+      </w:r>
+      <w:r>
+        <w:t xml:space="preserve"> </w:t>
+      </w:r>
+      <w:r>
+        <w:t xml:space="preserve">Stanford King Center on Global Development, Working</w:t>
+      </w:r>
+      <w:r>
+        <w:t xml:space="preserve"> </w:t>
+      </w:r>
+      <w:r>
+        <w:t xml:space="preserve">Paper No. 560, November 2015.</w:t>
+      </w:r>
+    </w:p>
+    <w:p>
+      <w:pPr>
+        <w:pStyle w:val="Compact"/>
+        <w:numPr>
+          <w:ilvl w:val="0"/>
+          <w:numId w:val="1025"/>
+        </w:numPr>
+      </w:pPr>
+      <w:r>
+        <w:t xml:space="preserve">K. Jiang.</w:t>
+      </w:r>
+      <w:r>
+        <w:t xml:space="preserve"> </w:t>
+      </w:r>
+      <w:r>
+        <w:rPr>
+          <w:i/>
+          <w:iCs/>
+        </w:rPr>
+        <w:t xml:space="preserve">Effective e-commerce price prediction with machine learning technologies.</w:t>
+      </w:r>
+      <w:r>
+        <w:t xml:space="preserve"> </w:t>
+      </w:r>
+      <w:r>
+        <w:t xml:space="preserve">ASENS</w:t>
+      </w:r>
+      <w:r>
+        <w:t xml:space="preserve"> </w:t>
+      </w:r>
+      <w:r>
+        <w:t xml:space="preserve">2024, ACM.</w:t>
+      </w:r>
+      <w:r>
+        <w:t xml:space="preserve"> </w:t>
+      </w:r>
+      <w:hyperlink r:id="rId63">
+        <w:r>
+          <w:rPr>
+            <w:rStyle w:val="Hyperlink"/>
+          </w:rPr>
+          <w:t xml:space="preserve">https://doi.org/10.1145/3677182.3677290</w:t>
+        </w:r>
+      </w:hyperlink>
+    </w:p>
+    <w:p>
+      <w:pPr>
+        <w:pStyle w:val="Compact"/>
+        <w:numPr>
+          <w:ilvl w:val="0"/>
+          <w:numId w:val="1025"/>
+        </w:numPr>
+      </w:pPr>
+      <w:r>
+        <w:rPr>
+          <w:i/>
+          <w:iCs/>
+        </w:rPr>
+        <w:t xml:space="preserve">Optimizing Handloom Price Prediction: Leveraging Diverse Features for Superior Accuracy Using</w:t>
+      </w:r>
+      <w:r>
+        <w:rPr>
+          <w:i/>
+          <w:iCs/>
+        </w:rPr>
+        <w:t xml:space="preserve"> </w:t>
+      </w:r>
+      <w:r>
+        <w:rPr>
+          <w:i/>
+          <w:iCs/>
+        </w:rPr>
+        <w:t xml:space="preserve">Machine Learning.</w:t>
+      </w:r>
+      <w:r>
+        <w:t xml:space="preserve"> </w:t>
+      </w:r>
+      <w:r>
+        <w:t xml:space="preserve">Springer.</w:t>
+      </w:r>
+      <w:r>
+        <w:t xml:space="preserve"> </w:t>
+      </w:r>
+      <w:hyperlink r:id="rId64">
+        <w:r>
+          <w:rPr>
+            <w:rStyle w:val="Hyperlink"/>
+          </w:rPr>
+          <w:t xml:space="preserve">https://doi.org/10.1007/978-3-032-06198-0_7</w:t>
+        </w:r>
+      </w:hyperlink>
+    </w:p>
+    <w:p>
+      <w:pPr>
+        <w:pStyle w:val="Compact"/>
+        <w:numPr>
+          <w:ilvl w:val="0"/>
+          <w:numId w:val="1025"/>
+        </w:numPr>
+      </w:pPr>
+      <w:r>
+        <w:rPr>
+          <w:i/>
+          <w:iCs/>
+        </w:rPr>
+        <w:t xml:space="preserve">A multimodal deep learning framework for integrating visual, textual and categorical features</w:t>
+      </w:r>
+      <w:r>
+        <w:rPr>
+          <w:i/>
+          <w:iCs/>
+        </w:rPr>
+        <w:t xml:space="preserve"> </w:t>
+      </w:r>
+      <w:r>
+        <w:rPr>
+          <w:i/>
+          <w:iCs/>
+        </w:rPr>
+        <w:t xml:space="preserve">in retail price estimation.</w:t>
+      </w:r>
+      <w:r>
+        <w:t xml:space="preserve"> </w:t>
+      </w:r>
+      <w:r>
+        <w:t xml:space="preserve">Array, 2025.</w:t>
+      </w:r>
+      <w:r>
+        <w:t xml:space="preserve"> </w:t>
+      </w:r>
+      <w:hyperlink r:id="rId65">
+        <w:r>
+          <w:rPr>
+            <w:rStyle w:val="Hyperlink"/>
+          </w:rPr>
+          <w:t xml:space="preserve">https://doi.org/10.1016/j.array.2025.100565</w:t>
+        </w:r>
+      </w:hyperlink>
+    </w:p>
+    <w:p>
+      <w:pPr>
+        <w:pStyle w:val="Compact"/>
+        <w:numPr>
+          <w:ilvl w:val="0"/>
+          <w:numId w:val="1025"/>
+        </w:numPr>
+      </w:pPr>
+      <w:r>
+        <w:t xml:space="preserve">A. Ait Si Ali, H. Seker, S. Farnie, J. Elliott.</w:t>
+      </w:r>
+      <w:r>
+        <w:t xml:space="preserve"> </w:t>
+      </w:r>
+      <w:r>
+        <w:rPr>
+          <w:i/>
+          <w:iCs/>
+        </w:rPr>
+        <w:t xml:space="preserve">Extensive Data Exploration for Automatic Price</w:t>
+      </w:r>
+      <w:r>
+        <w:rPr>
+          <w:i/>
+          <w:iCs/>
+        </w:rPr>
+        <w:t xml:space="preserve"> </w:t>
+      </w:r>
+      <w:r>
+        <w:rPr>
+          <w:i/>
+          <w:iCs/>
+        </w:rPr>
+        <w:t xml:space="preserve">Suggestion Using Item Description: Case Study for the Kaggle Mercari Challenge.</w:t>
+      </w:r>
+      <w:r>
+        <w:t xml:space="preserve"> </w:t>
+      </w:r>
+      <w:r>
+        <w:t xml:space="preserve">ICAAI 2018.</w:t>
+      </w:r>
+    </w:p>
+    <w:p>
+      <w:pPr>
+        <w:pStyle w:val="Compact"/>
+        <w:numPr>
+          <w:ilvl w:val="0"/>
+          <w:numId w:val="1025"/>
+        </w:numPr>
+      </w:pPr>
+      <w:r>
+        <w:rPr>
+          <w:i/>
+          <w:iCs/>
+        </w:rPr>
+        <w:t xml:space="preserve">The Role of Social Media and Product Differentiation in Etsy Micro-Manufacturing Shops.</w:t>
+      </w:r>
+      <w:r>
+        <w:t xml:space="preserve"> </w:t>
+      </w:r>
+      <w:r>
+        <w:t xml:space="preserve">SAIS 2017 Proceedings.</w:t>
+      </w:r>
+      <w:r>
+        <w:t xml:space="preserve"> </w:t>
+      </w:r>
+      <w:hyperlink r:id="rId66">
+        <w:r>
+          <w:rPr>
+            <w:rStyle w:val="Hyperlink"/>
+          </w:rPr>
+          <w:t xml:space="preserve">https://aisel.aisnet.org/sais2017/27</w:t>
+        </w:r>
+      </w:hyperlink>
+    </w:p>
+    <w:bookmarkEnd w:id="67"/>
+    <w:bookmarkEnd w:id="68"/>
+    <w:bookmarkEnd w:id="69"/>
     <w:sectPr>
       <w:footnotePr>
         <w:numRestart w:val="eachSect"/>
@@ -9361,6 +10882,69 @@
   </w:num>
   <w:num w:numId="1022">
     <w:abstractNumId w:val="991"/>
+  </w:num>
+  <w:num w:numId="1023">
+    <w:abstractNumId w:val="991"/>
+  </w:num>
+  <w:num w:numId="1024">
+    <w:abstractNumId w:val="99411"/>
+    <w:lvlOverride w:ilvl="0">
+      <w:startOverride w:val="1"/>
+    </w:lvlOverride>
+    <w:lvlOverride w:ilvl="1">
+      <w:startOverride w:val="1"/>
+    </w:lvlOverride>
+    <w:lvlOverride w:ilvl="2">
+      <w:startOverride w:val="1"/>
+    </w:lvlOverride>
+    <w:lvlOverride w:ilvl="3">
+      <w:startOverride w:val="1"/>
+    </w:lvlOverride>
+    <w:lvlOverride w:ilvl="4">
+      <w:startOverride w:val="1"/>
+    </w:lvlOverride>
+    <w:lvlOverride w:ilvl="5">
+      <w:startOverride w:val="1"/>
+    </w:lvlOverride>
+    <w:lvlOverride w:ilvl="6">
+      <w:startOverride w:val="1"/>
+    </w:lvlOverride>
+    <w:lvlOverride w:ilvl="7">
+      <w:startOverride w:val="1"/>
+    </w:lvlOverride>
+    <w:lvlOverride w:ilvl="8">
+      <w:startOverride w:val="1"/>
+    </w:lvlOverride>
+  </w:num>
+  <w:num w:numId="1025">
+    <w:abstractNumId w:val="99411"/>
+    <w:lvlOverride w:ilvl="0">
+      <w:startOverride w:val="1"/>
+    </w:lvlOverride>
+    <w:lvlOverride w:ilvl="1">
+      <w:startOverride w:val="1"/>
+    </w:lvlOverride>
+    <w:lvlOverride w:ilvl="2">
+      <w:startOverride w:val="1"/>
+    </w:lvlOverride>
+    <w:lvlOverride w:ilvl="3">
+      <w:startOverride w:val="1"/>
+    </w:lvlOverride>
+    <w:lvlOverride w:ilvl="4">
+      <w:startOverride w:val="1"/>
+    </w:lvlOverride>
+    <w:lvlOverride w:ilvl="5">
+      <w:startOverride w:val="1"/>
+    </w:lvlOverride>
+    <w:lvlOverride w:ilvl="6">
+      <w:startOverride w:val="1"/>
+    </w:lvlOverride>
+    <w:lvlOverride w:ilvl="7">
+      <w:startOverride w:val="1"/>
+    </w:lvlOverride>
+    <w:lvlOverride w:ilvl="8">
+      <w:startOverride w:val="1"/>
+    </w:lvlOverride>
   </w:num>
 </w:numbering>
 </file>

</xml_diff>